<commit_message>
added more content to document
I added in more security recommendations for the software.
</commit_message>
<xml_diff>
--- a/Security Audit/Audit checkup.docx
+++ b/Security Audit/Audit checkup.docx
@@ -63,6 +63,9 @@
     <w:p>
       <w:r>
         <w:t>This application is very unstable and often crashes over small things mostly when going through tabs quickly and the slighting wheel.</w:t>
+      </w:r>
+      <w:r>
+        <w:t xml:space="preserve"> This code needs to become more efficient when handling tasks.</w:t>
       </w:r>
     </w:p>
     <w:p>
@@ -241,7 +244,6 @@
         <w:t>:</w:t>
       </w:r>
     </w:p>
-    <w:p/>
     <w:p>
       <w:pPr>
         <w:pStyle w:val="Subtitle"/>
@@ -289,14 +291,283 @@
     <w:p/>
     <w:p>
       <w:pPr>
+        <w:pStyle w:val="Subtitle"/>
+      </w:pPr>
+      <w:r>
+        <w:t xml:space="preserve">Anti </w:t>
+      </w:r>
+      <w:r>
+        <w:t>SQL</w:t>
+      </w:r>
+      <w:r>
+        <w:t xml:space="preserve"> </w:t>
+      </w:r>
+      <w:r>
+        <w:t>I</w:t>
+      </w:r>
+      <w:r>
+        <w:t>njections:</w:t>
+      </w:r>
+    </w:p>
+    <w:p>
+      <w:r>
+        <w:t xml:space="preserve">Although I </w:t>
+      </w:r>
+      <w:r>
+        <w:t>could not</w:t>
+      </w:r>
+      <w:r>
+        <w:t xml:space="preserve"> discover any SQL injections it still may be possible. </w:t>
+      </w:r>
+      <w:r>
+        <w:t>F</w:t>
+      </w:r>
+      <w:r>
+        <w:t xml:space="preserve">or </w:t>
+      </w:r>
+      <w:r>
+        <w:t>example,</w:t>
+      </w:r>
+      <w:r>
+        <w:t xml:space="preserve"> </w:t>
+      </w:r>
+      <w:r>
+        <w:t>this is the password login screen you enter:</w:t>
+      </w:r>
+    </w:p>
+    <w:p/>
+    <w:p>
+      <w:pPr>
         <w:rPr>
-          <w:rFonts w:asciiTheme="majorHAnsi" w:eastAsiaTheme="majorEastAsia" w:hAnsiTheme="majorHAnsi" w:cstheme="majorBidi"/>
-          <w:color w:val="0F4761" w:themeColor="accent1" w:themeShade="BF"/>
-          <w:sz w:val="40"/>
-          <w:szCs w:val="40"/>
+          <w:b/>
+          <w:bCs/>
+          <w:i/>
+          <w:iCs/>
         </w:rPr>
       </w:pPr>
-    </w:p>
+      <w:r>
+        <w:rPr>
+          <w:b/>
+          <w:bCs/>
+          <w:i/>
+          <w:iCs/>
+        </w:rPr>
+        <w:t>user: admin, and password is: strongpassword</w:t>
+      </w:r>
+    </w:p>
+    <w:p/>
+    <w:p>
+      <w:r>
+        <w:t xml:space="preserve">The code </w:t>
+      </w:r>
+      <w:r>
+        <w:t>internally</w:t>
+      </w:r>
+      <w:r>
+        <w:t xml:space="preserve"> </w:t>
+      </w:r>
+      <w:r>
+        <w:t>(</w:t>
+      </w:r>
+      <w:r>
+        <w:t>Pseudocode example</w:t>
+      </w:r>
+      <w:r>
+        <w:t xml:space="preserve">) </w:t>
+      </w:r>
+      <w:r>
+        <w:t xml:space="preserve">would </w:t>
+      </w:r>
+      <w:r>
+        <w:t>process it as:</w:t>
+      </w:r>
+    </w:p>
+    <w:p>
+      <w:pPr>
+        <w:rPr>
+          <w:b/>
+          <w:bCs/>
+          <w:i/>
+          <w:iCs/>
+        </w:rPr>
+      </w:pPr>
+      <w:r>
+        <w:rPr>
+          <w:b/>
+          <w:bCs/>
+          <w:i/>
+          <w:iCs/>
+        </w:rPr>
+        <w:t>User=’admin’ password=’strongpassword’</w:t>
+      </w:r>
+    </w:p>
+    <w:p/>
+    <w:p>
+      <w:r>
+        <w:t xml:space="preserve">An SQL injection would </w:t>
+      </w:r>
+      <w:r>
+        <w:t xml:space="preserve">take advantage of the internal code and trick it by entering the ‘ symbol to make it look like that that was the end of the </w:t>
+      </w:r>
+      <w:r>
+        <w:t>user’s</w:t>
+      </w:r>
+      <w:r>
+        <w:t xml:space="preserve"> text entered but it wasn’t. the attacker could then enter more new code after the ‘ symbol. For </w:t>
+      </w:r>
+      <w:r>
+        <w:t>example,</w:t>
+      </w:r>
+      <w:r>
+        <w:t xml:space="preserve"> </w:t>
+      </w:r>
+      <w:r>
+        <w:t xml:space="preserve">the attacker could enter in the password field </w:t>
+      </w:r>
+      <w:r>
+        <w:rPr>
+          <w:b/>
+          <w:bCs/>
+          <w:i/>
+          <w:iCs/>
+        </w:rPr>
+        <w:t>strongpassword’=’succes</w:t>
+      </w:r>
+      <w:r>
+        <w:t>s</w:t>
+      </w:r>
+      <w:r>
+        <w:t xml:space="preserve"> it would look like in the code:</w:t>
+      </w:r>
+    </w:p>
+    <w:p>
+      <w:pPr>
+        <w:rPr>
+          <w:b/>
+          <w:bCs/>
+          <w:i/>
+          <w:iCs/>
+        </w:rPr>
+      </w:pPr>
+      <w:r>
+        <w:rPr>
+          <w:b/>
+          <w:bCs/>
+          <w:i/>
+          <w:iCs/>
+        </w:rPr>
+        <w:t>User=’admin’ password=’strongpassword’=’success’</w:t>
+      </w:r>
+    </w:p>
+    <w:p/>
+    <w:p>
+      <w:r>
+        <w:t>This hypothetically could allow the user to modify and change the internal code just by entering it in the log in or anywhere on the application.</w:t>
+      </w:r>
+    </w:p>
+    <w:p/>
+    <w:p/>
+    <w:p>
+      <w:pPr>
+        <w:rPr>
+          <w:rFonts w:eastAsiaTheme="majorEastAsia" w:cstheme="majorBidi"/>
+          <w:color w:val="595959" w:themeColor="text1" w:themeTint="A6"/>
+          <w:spacing w:val="15"/>
+          <w:sz w:val="28"/>
+          <w:szCs w:val="28"/>
+        </w:rPr>
+      </w:pPr>
+      <w:r>
+        <w:br w:type="page"/>
+      </w:r>
+    </w:p>
+    <w:p>
+      <w:pPr>
+        <w:pStyle w:val="Subtitle"/>
+      </w:pPr>
+      <w:r>
+        <w:lastRenderedPageBreak/>
+        <w:t>Make sure everyone uses work emails and strong password</w:t>
+      </w:r>
+      <w:r>
+        <w:t>:</w:t>
+      </w:r>
+    </w:p>
+    <w:p>
+      <w:r>
+        <w:t>The administrators for checkup must not use personal emails and have an email account only for work, with two factor authentication. Passwords should be automatically changed every few months to a year for both the email provider and the checkup application for all users.</w:t>
+      </w:r>
+    </w:p>
+    <w:p/>
+    <w:p>
+      <w:pPr>
+        <w:pStyle w:val="Subtitle"/>
+      </w:pPr>
+      <w:r>
+        <w:t>Have a backup plan:</w:t>
+      </w:r>
+    </w:p>
+    <w:p>
+      <w:r>
+        <w:t xml:space="preserve">Plan regular automated backups of the application and user data. This will prevent instances of data loss. These backups need to be reliable and tested to see if backup restore is successful. Multiple backup locations </w:t>
+      </w:r>
+      <w:proofErr w:type="gramStart"/>
+      <w:r>
+        <w:t>is</w:t>
+      </w:r>
+      <w:proofErr w:type="gramEnd"/>
+      <w:r>
+        <w:t xml:space="preserve"> also recommended and ensure they are kept secure with encryption.</w:t>
+      </w:r>
+    </w:p>
+    <w:p/>
+    <w:p>
+      <w:pPr>
+        <w:pStyle w:val="Subtitle"/>
+      </w:pPr>
+      <w:r>
+        <w:t>Digital forensics:</w:t>
+      </w:r>
+    </w:p>
+    <w:p>
+      <w:r>
+        <w:t>This involves tracking all changes being made internally to the code and what users are doing. These digital forensic services also trigger an alert if it spots any</w:t>
+      </w:r>
+      <w:r>
+        <w:t xml:space="preserve">thing malicious. It can also trace where any cyber attacks originate from. </w:t>
+      </w:r>
+      <w:r>
+        <w:t xml:space="preserve">I recommend using </w:t>
+      </w:r>
+      <w:proofErr w:type="spellStart"/>
+      <w:r>
+        <w:t>Wazuh</w:t>
+      </w:r>
+      <w:proofErr w:type="spellEnd"/>
+      <w:r>
+        <w:t xml:space="preserve"> as it free and has all the necessary tools to get the job done.</w:t>
+      </w:r>
+    </w:p>
+    <w:p/>
+    <w:p/>
+    <w:p>
+      <w:pPr>
+        <w:pStyle w:val="Subtitle"/>
+      </w:pPr>
+      <w:r>
+        <w:t>Restrict user access privilege:</w:t>
+      </w:r>
+    </w:p>
+    <w:p>
+      <w:r>
+        <w:t>I recommend restricting some internal users to access to certain files and if they can read or write</w:t>
+      </w:r>
+      <w:r>
+        <w:t xml:space="preserve"> to only those who truly need it. this lessens the likelihood of a serious cyber incident because if an attacker gains access to one internal user account, they won’t have access to everything and may not be able to read or write. There should also be internal automated logging to trace changes made internally if in an event of a cyber incident to see what has happened.</w:t>
+      </w:r>
+    </w:p>
+    <w:p/>
+    <w:p/>
     <w:p>
       <w:pPr>
         <w:pStyle w:val="Heading1"/>
@@ -309,11 +580,9 @@
       <w:r>
         <w:t xml:space="preserve">I discovered many bugs in the software and have </w:t>
       </w:r>
-      <w:proofErr w:type="spellStart"/>
-      <w:r>
-        <w:t>categoriesed</w:t>
-      </w:r>
-      <w:proofErr w:type="spellEnd"/>
+      <w:r>
+        <w:t>categorised</w:t>
+      </w:r>
       <w:r>
         <w:t xml:space="preserve"> them as IOS and Android in the next few pages a head.</w:t>
       </w:r>

</xml_diff>